<commit_message>
Update SCW16 Paper 01 selectivity diagnostics and outputs
</commit_message>
<xml_diff>
--- a/docs/SCW16-Paper-01.docx
+++ b/docs/SCW16-Paper-01.docx
@@ -157,7 +157,7 @@
         <w:pStyle w:val="BodyText"/>
       </w:pPr>
       <w:r>
-        <w:t xml:space="preserve">04 April 2026</w:t>
+        <w:t xml:space="preserve">06 April 2026</w:t>
       </w:r>
     </w:p>
     <w:bookmarkStart w:id="24" w:name="abstract"/>
@@ -2705,7 +2705,7 @@
       </w:r>
     </w:p>
     <w:bookmarkEnd w:id="37"/>
-    <w:bookmarkStart w:id="146" w:name="proposed-simplified-alternatives"/>
+    <w:bookmarkStart w:id="150" w:name="proposed-simplified-alternatives"/>
     <w:p>
       <w:pPr>
         <w:pStyle w:val="Heading1"/>
@@ -19843,7 +19843,7 @@
       </w:tr>
     </w:tbl>
     <w:bookmarkEnd w:id="142"/>
-    <w:bookmarkStart w:id="145" w:name="fixed-reference-point-alternatives"/>
+    <w:bookmarkStart w:id="149" w:name="fixed-reference-point-alternatives"/>
     <w:p>
       <w:pPr>
         <w:pStyle w:val="Heading2"/>
@@ -19994,6 +19994,441 @@
         <w:t xml:space="preserve">simulation design.</w:t>
       </w:r>
     </w:p>
+    <w:p>
+      <w:pPr>
+        <w:pStyle w:val="BodyText"/>
+      </w:pPr>
+      <w:r>
+        <w:rPr>
+          <w:b/>
+          <w:bCs/>
+        </w:rPr>
+        <w:t xml:space="preserve">91.</w:t>
+      </w:r>
+      <w:r>
+        <w:t xml:space="preserve"> </w:t>
+      </w:r>
+      <w:r>
+        <w:t xml:space="preserve">As an additional diagnostic of selectivity dynamics, the fishery-combined mean selected age can be tracked through time:</w:t>
+      </w:r>
+    </w:p>
+    <w:p>
+      <w:pPr>
+        <w:pStyle w:val="BodyText"/>
+      </w:pPr>
+      <m:oMathPara>
+        <m:oMathParaPr>
+          <m:jc m:val="center"/>
+        </m:oMathParaPr>
+        <m:oMath>
+          <m:sSub>
+            <m:e>
+              <m:acc>
+                <m:accPr>
+                  <m:chr m:val="‾"/>
+                </m:accPr>
+                <m:e>
+                  <m:r>
+                    <m:t>a</m:t>
+                  </m:r>
+                </m:e>
+              </m:acc>
+            </m:e>
+            <m:sub>
+              <m:r>
+                <m:t>t</m:t>
+              </m:r>
+            </m:sub>
+          </m:sSub>
+          <m:r>
+            <m:rPr>
+              <m:sty m:val="p"/>
+            </m:rPr>
+            <m:t>=</m:t>
+          </m:r>
+          <m:f>
+            <m:fPr>
+              <m:type m:val="bar"/>
+            </m:fPr>
+            <m:num>
+              <m:nary>
+                <m:naryPr>
+                  <m:chr m:val="∑"/>
+                  <m:limLoc m:val="undOvr"/>
+                  <m:subHide m:val="off"/>
+                  <m:supHide m:val="on"/>
+                </m:naryPr>
+                <m:sub>
+                  <m:r>
+                    <m:t>a</m:t>
+                  </m:r>
+                </m:sub>
+                <m:sup>
+                  <m:r>
+                    <m:t>​</m:t>
+                  </m:r>
+                </m:sup>
+                <m:e>
+                  <m:sSub>
+                    <m:e>
+                      <m:r>
+                        <m:t>F</m:t>
+                      </m:r>
+                    </m:e>
+                    <m:sub>
+                      <m:r>
+                        <m:t>a</m:t>
+                      </m:r>
+                      <m:r>
+                        <m:rPr>
+                          <m:sty m:val="p"/>
+                        </m:rPr>
+                        <m:t>,</m:t>
+                      </m:r>
+                      <m:r>
+                        <m:t>t</m:t>
+                      </m:r>
+                    </m:sub>
+                  </m:sSub>
+                </m:e>
+              </m:nary>
+              <m:r>
+                <m:t>a</m:t>
+              </m:r>
+            </m:num>
+            <m:den>
+              <m:nary>
+                <m:naryPr>
+                  <m:chr m:val="∑"/>
+                  <m:limLoc m:val="undOvr"/>
+                  <m:subHide m:val="off"/>
+                  <m:supHide m:val="on"/>
+                </m:naryPr>
+                <m:sub>
+                  <m:r>
+                    <m:t>a</m:t>
+                  </m:r>
+                </m:sub>
+                <m:sup>
+                  <m:r>
+                    <m:t>​</m:t>
+                  </m:r>
+                </m:sup>
+                <m:e>
+                  <m:sSub>
+                    <m:e>
+                      <m:r>
+                        <m:t>F</m:t>
+                      </m:r>
+                    </m:e>
+                    <m:sub>
+                      <m:r>
+                        <m:t>a</m:t>
+                      </m:r>
+                      <m:r>
+                        <m:rPr>
+                          <m:sty m:val="p"/>
+                        </m:rPr>
+                        <m:t>,</m:t>
+                      </m:r>
+                      <m:r>
+                        <m:t>t</m:t>
+                      </m:r>
+                    </m:sub>
+                  </m:sSub>
+                </m:e>
+              </m:nary>
+            </m:den>
+          </m:f>
+          <m:r>
+            <m:rPr>
+              <m:sty m:val="p"/>
+            </m:rPr>
+            <m:t>,</m:t>
+          </m:r>
+        </m:oMath>
+      </m:oMathPara>
+    </w:p>
+    <w:p>
+      <w:pPr>
+        <w:pStyle w:val="FirstParagraph"/>
+      </w:pPr>
+      <w:r>
+        <w:t xml:space="preserve">where</w:t>
+      </w:r>
+      <w:r>
+        <w:t xml:space="preserve"> </w:t>
+      </w:r>
+      <m:oMath>
+        <m:sSub>
+          <m:e>
+            <m:r>
+              <m:t>F</m:t>
+            </m:r>
+          </m:e>
+          <m:sub>
+            <m:r>
+              <m:t>a</m:t>
+            </m:r>
+            <m:r>
+              <m:rPr>
+                <m:sty m:val="p"/>
+              </m:rPr>
+              <m:t>,</m:t>
+            </m:r>
+            <m:r>
+              <m:t>t</m:t>
+            </m:r>
+          </m:sub>
+        </m:sSub>
+      </m:oMath>
+      <w:r>
+        <w:t xml:space="preserve"> </w:t>
+      </w:r>
+      <w:r>
+        <w:t xml:space="preserve">is total fishing mortality at age in year</w:t>
+      </w:r>
+      <w:r>
+        <w:t xml:space="preserve"> </w:t>
+      </w:r>
+      <m:oMath>
+        <m:r>
+          <m:t>t</m:t>
+        </m:r>
+      </m:oMath>
+      <w:r>
+        <w:t xml:space="preserve">. The resulting trend for the SC13 single-stock model is shown in</w:t>
+      </w:r>
+      <w:r>
+        <w:t xml:space="preserve"> </w:t>
+      </w:r>
+      <w:hyperlink w:anchor="fig-mean-selected-age">
+        <w:r>
+          <w:rPr>
+            <w:rStyle w:val="Hyperlink"/>
+          </w:rPr>
+          <w:t xml:space="preserve">Figure 17</w:t>
+        </w:r>
+      </w:hyperlink>
+      <w:r>
+        <w:t xml:space="preserve">.</w:t>
+      </w:r>
+    </w:p>
+    <w:tbl>
+      <w:tblPr>
+        <w:tblStyle w:val="Table"/>
+        <w:tblW w:type="pct" w:w="5000"/>
+        <w:tblLayout w:type="fixed"/>
+        <w:tblLook w:firstRow="0" w:lastRow="0" w:firstColumn="0" w:lastColumn="0" w:noHBand="0" w:noVBand="0" w:val="0000"/>
+      </w:tblPr>
+      <w:tblGrid>
+        <w:gridCol w:w="7920"/>
+      </w:tblGrid>
+      <w:tr>
+        <w:tc>
+          <w:tcPr/>
+          <w:bookmarkStart w:id="146" w:name="fig-mean-selected-age"/>
+          <w:p>
+            <w:pPr>
+              <w:pStyle w:val="Compact"/>
+              <w:jc w:val="center"/>
+            </w:pPr>
+            <w:r>
+              <w:drawing>
+                <wp:inline>
+                  <wp:extent cx="5334000" cy="3062882"/>
+                  <wp:effectExtent b="0" l="0" r="0" t="0"/>
+                  <wp:docPr descr="" title="" id="144" name="Picture"/>
+                  <a:graphic>
+                    <a:graphicData uri="http://schemas.openxmlformats.org/drawingml/2006/picture">
+                      <pic:pic>
+                        <pic:nvPicPr>
+                          <pic:cNvPr descr="SCW16-Paper-01_files/figure-docx/fig-mean-selected-age-1.png" id="145" name="Picture"/>
+                          <pic:cNvPicPr>
+                            <a:picLocks noChangeArrowheads="1" noChangeAspect="1"/>
+                          </pic:cNvPicPr>
+                        </pic:nvPicPr>
+                        <pic:blipFill>
+                          <a:blip r:embed="rId143"/>
+                          <a:stretch>
+                            <a:fillRect/>
+                          </a:stretch>
+                        </pic:blipFill>
+                        <pic:spPr bwMode="auto">
+                          <a:xfrm>
+                            <a:off x="0" y="0"/>
+                            <a:ext cx="5334000" cy="3062882"/>
+                          </a:xfrm>
+                          <a:prstGeom prst="rect">
+                            <a:avLst/>
+                          </a:prstGeom>
+                          <a:noFill/>
+                          <a:ln w="9525">
+                            <a:noFill/>
+                            <a:headEnd/>
+                            <a:tailEnd/>
+                          </a:ln>
+                        </pic:spPr>
+                      </pic:pic>
+                    </a:graphicData>
+                  </a:graphic>
+                </wp:inline>
+              </w:drawing>
+            </w:r>
+          </w:p>
+          <w:p>
+            <w:pPr>
+              <w:jc w:val="center"/>
+            </w:pPr>
+            <w:pPr>
+              <w:jc w:val="left"/>
+              <w:spacing w:before="200"/>
+              <w:pStyle w:val="ImageCaption"/>
+            </w:pPr>
+            <w:r>
+              <w:t xml:space="preserve">Figure 17: Time trend in fishery-combined mean selected age for</w:t>
+            </w:r>
+            <w:r>
+              <w:t xml:space="preserve"> </w:t>
+            </w:r>
+            <w:r>
+              <w:rPr>
+                <w:rStyle w:val="VerbatimChar"/>
+              </w:rPr>
+              <w:t xml:space="preserve">h1_1.14</w:t>
+            </w:r>
+            <w:r>
+              <w:t xml:space="preserve">, computed as</w:t>
+            </w:r>
+            <w:r>
+              <w:t xml:space="preserve"> </w:t>
+            </w:r>
+            <m:oMath>
+              <m:sSub>
+                <m:e>
+                  <m:acc>
+                    <m:accPr>
+                      <m:chr m:val="‾"/>
+                    </m:accPr>
+                    <m:e>
+                      <m:r>
+                        <m:t>a</m:t>
+                      </m:r>
+                    </m:e>
+                  </m:acc>
+                </m:e>
+                <m:sub>
+                  <m:r>
+                    <m:t>t</m:t>
+                  </m:r>
+                </m:sub>
+              </m:sSub>
+              <m:r>
+                <m:rPr>
+                  <m:sty m:val="p"/>
+                </m:rPr>
+                <m:t>=</m:t>
+              </m:r>
+              <m:nary>
+                <m:naryPr>
+                  <m:chr m:val="∑"/>
+                  <m:limLoc m:val="undOvr"/>
+                  <m:subHide m:val="off"/>
+                  <m:supHide m:val="on"/>
+                </m:naryPr>
+                <m:sub>
+                  <m:r>
+                    <m:t>a</m:t>
+                  </m:r>
+                </m:sub>
+                <m:sup>
+                  <m:r>
+                    <m:t>​</m:t>
+                  </m:r>
+                </m:sup>
+                <m:e>
+                  <m:sSub>
+                    <m:e>
+                      <m:r>
+                        <m:t>F</m:t>
+                      </m:r>
+                    </m:e>
+                    <m:sub>
+                      <m:r>
+                        <m:t>a</m:t>
+                      </m:r>
+                      <m:r>
+                        <m:rPr>
+                          <m:sty m:val="p"/>
+                        </m:rPr>
+                        <m:t>,</m:t>
+                      </m:r>
+                      <m:r>
+                        <m:t>t</m:t>
+                      </m:r>
+                    </m:sub>
+                  </m:sSub>
+                </m:e>
+              </m:nary>
+              <m:r>
+                <m:t>a</m:t>
+              </m:r>
+              <m:r>
+                <m:rPr>
+                  <m:sty m:val="p"/>
+                </m:rPr>
+                <m:t>/</m:t>
+              </m:r>
+              <m:nary>
+                <m:naryPr>
+                  <m:chr m:val="∑"/>
+                  <m:limLoc m:val="undOvr"/>
+                  <m:subHide m:val="off"/>
+                  <m:supHide m:val="on"/>
+                </m:naryPr>
+                <m:sub>
+                  <m:r>
+                    <m:t>a</m:t>
+                  </m:r>
+                </m:sub>
+                <m:sup>
+                  <m:r>
+                    <m:t>​</m:t>
+                  </m:r>
+                </m:sup>
+                <m:e>
+                  <m:sSub>
+                    <m:e>
+                      <m:r>
+                        <m:t>F</m:t>
+                      </m:r>
+                    </m:e>
+                    <m:sub>
+                      <m:r>
+                        <m:t>a</m:t>
+                      </m:r>
+                      <m:r>
+                        <m:rPr>
+                          <m:sty m:val="p"/>
+                        </m:rPr>
+                        <m:t>,</m:t>
+                      </m:r>
+                      <m:r>
+                        <m:t>t</m:t>
+                      </m:r>
+                    </m:sub>
+                  </m:sSub>
+                </m:e>
+              </m:nary>
+            </m:oMath>
+            <w:r>
+              <w:t xml:space="preserve">.</w:t>
+            </w:r>
+          </w:p>
+          <w:bookmarkEnd w:id="146"/>
+        </w:tc>
+      </w:tr>
+    </w:tbl>
     <w:tbl>
       <w:tblPr>
         <w:tblStyle w:val="Table"/>
@@ -20035,12 +20470,12 @@
                 <wp:inline>
                   <wp:extent cx="152400" cy="152400"/>
                   <wp:effectExtent b="0" l="0" r="0" t="0"/>
-                  <wp:docPr descr="" title="" id="143" name="Picture"/>
+                  <wp:docPr descr="" title="" id="147" name="Picture"/>
                   <a:graphic>
                     <a:graphicData uri="http://schemas.openxmlformats.org/drawingml/2006/picture">
                       <pic:pic>
                         <pic:nvPicPr>
-                          <pic:cNvPr descr="/Applications/quarto/share/formats/docx/note.png" id="144" name="Picture"/>
+                          <pic:cNvPr descr="/Applications/quarto/share/formats/docx/note.png" id="148" name="Picture"/>
                           <pic:cNvPicPr>
                             <a:picLocks noChangeArrowheads="1" noChangeAspect="1"/>
                           </pic:cNvPicPr>
@@ -20107,7 +20542,7 @@
                 <w:b/>
                 <w:bCs/>
               </w:rPr>
-              <w:t xml:space="preserve">91.</w:t>
+              <w:t xml:space="preserve">92.</w:t>
             </w:r>
             <w:r>
               <w:t xml:space="preserve"> </w:t>
@@ -20239,7 +20674,7 @@
           <w:b/>
           <w:bCs/>
         </w:rPr>
-        <w:t xml:space="preserve">92.</w:t>
+        <w:t xml:space="preserve">93.</w:t>
       </w:r>
       <w:r>
         <w:t xml:space="preserve"> </w:t>
@@ -20248,9 +20683,9 @@
         <w:t xml:space="preserve">The recommended approach is therefore to calculate reference points once, using the terminal selectivity block and the current biological schedules, and use those fixed values as management benchmarks throughout the MSE simulation. Sensitivity to the choice of reference period can be examined as part of robustness testing.</w:t>
       </w:r>
     </w:p>
-    <w:bookmarkEnd w:id="145"/>
-    <w:bookmarkEnd w:id="146"/>
-    <w:bookmarkStart w:id="147" w:name="summary"/>
+    <w:bookmarkEnd w:id="149"/>
+    <w:bookmarkEnd w:id="150"/>
+    <w:bookmarkStart w:id="151" w:name="summary"/>
     <w:p>
       <w:pPr>
         <w:pStyle w:val="Heading1"/>
@@ -20268,7 +20703,7 @@
           <w:b/>
           <w:bCs/>
         </w:rPr>
-        <w:t xml:space="preserve">93.</w:t>
+        <w:t xml:space="preserve">94.</w:t>
       </w:r>
       <w:r>
         <w:t xml:space="preserve"> </w:t>
@@ -20920,7 +21355,7 @@
           <w:b/>
           <w:bCs/>
         </w:rPr>
-        <w:t xml:space="preserve">94.</w:t>
+        <w:t xml:space="preserve">95.</w:t>
       </w:r>
       <w:r>
         <w:t xml:space="preserve"> </w:t>
@@ -20929,8 +21364,8 @@
         <w:t xml:space="preserve">Taken together, these results suggest that the next stage should focus less on broad additional simplification and more on selecting a compact set of well-motivated operating models and robustness scenarios. The current evidence points toward carrying forward a reduced-index baseline, a single-stock model that preserves South-Central Chile selectivity flexibility, a harmonized two-stock comparator, and targeted robustness cases for q variability, projection selectivity, and alternative stock-2 recruitment structure.</w:t>
       </w:r>
     </w:p>
-    <w:bookmarkEnd w:id="147"/>
-    <w:bookmarkStart w:id="157" w:name="appendix-compact-equation-summary"/>
+    <w:bookmarkEnd w:id="151"/>
+    <w:bookmarkStart w:id="161" w:name="appendix-compact-equation-summary"/>
     <w:p>
       <w:pPr>
         <w:pStyle w:val="Heading1"/>
@@ -20947,7 +21382,7 @@
         <w:t xml:space="preserve">This appendix gives a compact schematic description of the equations underlying the SC13 Joint Jack Mackerel Model. It is intended to summarize the structure used in this working paper rather than to reproduce every implementation detail of the ADMB code or every option described in the technical annex and user guide.</w:t>
       </w:r>
     </w:p>
-    <w:bookmarkStart w:id="148" w:name="notation"/>
+    <w:bookmarkStart w:id="152" w:name="notation"/>
     <w:p>
       <w:pPr>
         <w:pStyle w:val="Heading2"/>
@@ -21537,8 +21972,8 @@
         <w:t xml:space="preserve">.</w:t>
       </w:r>
     </w:p>
-    <w:bookmarkEnd w:id="148"/>
-    <w:bookmarkStart w:id="149" w:name="population-update"/>
+    <w:bookmarkEnd w:id="152"/>
+    <w:bookmarkStart w:id="153" w:name="population-update"/>
     <w:p>
       <w:pPr>
         <w:pStyle w:val="Heading2"/>
@@ -22546,8 +22981,8 @@
         <w:t xml:space="preserve">is the fraction of annual mortality occurring before spawning.</w:t>
       </w:r>
     </w:p>
-    <w:bookmarkEnd w:id="149"/>
-    <w:bookmarkStart w:id="150" w:name="stock-recruitment-relationship"/>
+    <w:bookmarkEnd w:id="153"/>
+    <w:bookmarkStart w:id="154" w:name="stock-recruitment-relationship"/>
     <w:p>
       <w:pPr>
         <w:pStyle w:val="Heading2"/>
@@ -23072,8 +23507,8 @@
         <w:t xml:space="preserve">, recruitment is assigned across two stocks with a more complex regime structure, including the 1999 shift described in the control file.</w:t>
       </w:r>
     </w:p>
-    <w:bookmarkEnd w:id="150"/>
-    <w:bookmarkStart w:id="151" w:name="fishing-mortality-and-catch"/>
+    <w:bookmarkEnd w:id="154"/>
+    <w:bookmarkStart w:id="155" w:name="fishing-mortality-and-catch"/>
     <w:p>
       <w:pPr>
         <w:pStyle w:val="Heading2"/>
@@ -23749,8 +24184,8 @@
         </m:oMath>
       </m:oMathPara>
     </w:p>
-    <w:bookmarkEnd w:id="151"/>
-    <w:bookmarkStart w:id="152" w:name="abundance-indices"/>
+    <w:bookmarkEnd w:id="155"/>
+    <w:bookmarkStart w:id="156" w:name="abundance-indices"/>
     <w:p>
       <w:pPr>
         <w:pStyle w:val="Heading2"/>
@@ -24157,8 +24592,8 @@
         <w:t xml:space="preserve">places the survey or CPUE observation within the year. This expression is schematic because some indices are closer to numbers-at-age and others to biomass, but it captures the model logic used across the SC13 index components.</w:t>
       </w:r>
     </w:p>
-    <w:bookmarkEnd w:id="152"/>
-    <w:bookmarkStart w:id="153" w:name="age-and-length-compositions"/>
+    <w:bookmarkEnd w:id="156"/>
+    <w:bookmarkStart w:id="157" w:name="age-and-length-compositions"/>
     <w:p>
       <w:pPr>
         <w:pStyle w:val="Heading2"/>
@@ -24671,8 +25106,8 @@
         <w:t xml:space="preserve">, derived from the von Bertalanffy growth specification used by the model.</w:t>
       </w:r>
     </w:p>
-    <w:bookmarkEnd w:id="153"/>
-    <w:bookmarkStart w:id="154" w:name="observation-likelihoods"/>
+    <w:bookmarkEnd w:id="157"/>
+    <w:bookmarkStart w:id="158" w:name="observation-likelihoods"/>
     <w:p>
       <w:pPr>
         <w:pStyle w:val="Heading2"/>
@@ -25281,8 +25716,8 @@
         <w:t xml:space="preserve">The SC13 model uses Francis weighting for age-composition effective sample sizes, so the composition likelihood is strongly affected by those externally specified weights.</w:t>
       </w:r>
     </w:p>
-    <w:bookmarkEnd w:id="154"/>
-    <w:bookmarkStart w:id="155" w:name="objective-function"/>
+    <w:bookmarkEnd w:id="158"/>
+    <w:bookmarkStart w:id="159" w:name="objective-function"/>
     <w:p>
       <w:pPr>
         <w:pStyle w:val="Heading2"/>
@@ -25628,8 +26063,8 @@
         <w:t xml:space="preserve">, is especially important in SC13 because the model includes extensive penalties on fishery and survey selectivity trajectories to regularize the time-varying non-parametric selectivity schedules.</w:t>
       </w:r>
     </w:p>
-    <w:bookmarkEnd w:id="155"/>
-    <w:bookmarkStart w:id="156" w:name="dynamic-reference-points"/>
+    <w:bookmarkEnd w:id="159"/>
+    <w:bookmarkStart w:id="160" w:name="dynamic-reference-points"/>
     <w:p>
       <w:pPr>
         <w:pStyle w:val="Heading2"/>
@@ -26083,9 +26518,9 @@
         <w:t xml:space="preserve">vary through time in the SC13 assessment rather than remaining fixed constants.</w:t>
       </w:r>
     </w:p>
-    <w:bookmarkEnd w:id="156"/>
-    <w:bookmarkEnd w:id="157"/>
-    <w:bookmarkStart w:id="186" w:name="references"/>
+    <w:bookmarkEnd w:id="160"/>
+    <w:bookmarkEnd w:id="161"/>
+    <w:bookmarkStart w:id="190" w:name="references"/>
     <w:p>
       <w:pPr>
         <w:pStyle w:val="Heading1"/>
@@ -26094,8 +26529,8 @@
         <w:t xml:space="preserve">References</w:t>
       </w:r>
     </w:p>
-    <w:bookmarkStart w:id="185" w:name="refs"/>
-    <w:bookmarkStart w:id="158" w:name="ref-beverton1957dynamics"/>
+    <w:bookmarkStart w:id="189" w:name="refs"/>
+    <w:bookmarkStart w:id="162" w:name="ref-beverton1957dynamics"/>
     <w:p>
       <w:pPr>
         <w:pStyle w:val="Bibliography"/>
@@ -26120,8 +26555,8 @@
         <w:t xml:space="preserve">(Vol. 19, p. 533). H. M. Stationery Office.</w:t>
       </w:r>
     </w:p>
-    <w:bookmarkEnd w:id="158"/>
-    <w:bookmarkStart w:id="160" w:name="ref-butterworth1999procedures"/>
+    <w:bookmarkEnd w:id="162"/>
+    <w:bookmarkStart w:id="164" w:name="ref-butterworth1999procedures"/>
     <w:p>
       <w:pPr>
         <w:pStyle w:val="Bibliography"/>
@@ -26158,7 +26593,7 @@
       <w:r>
         <w:t xml:space="preserve"> </w:t>
       </w:r>
-      <w:hyperlink r:id="rId159">
+      <w:hyperlink r:id="rId163">
         <w:r>
           <w:rPr>
             <w:rStyle w:val="Hyperlink"/>
@@ -26167,8 +26602,8 @@
         </w:r>
       </w:hyperlink>
     </w:p>
-    <w:bookmarkEnd w:id="160"/>
-    <w:bookmarkStart w:id="162" w:name="ref-carruthers2024roadmap"/>
+    <w:bookmarkEnd w:id="164"/>
+    <w:bookmarkStart w:id="166" w:name="ref-carruthers2024roadmap"/>
     <w:p>
       <w:pPr>
         <w:pStyle w:val="Bibliography"/>
@@ -26231,7 +26666,7 @@
       <w:r>
         <w:t xml:space="preserve"> </w:t>
       </w:r>
-      <w:hyperlink r:id="rId161">
+      <w:hyperlink r:id="rId165">
         <w:r>
           <w:rPr>
             <w:rStyle w:val="Hyperlink"/>
@@ -26240,8 +26675,8 @@
         </w:r>
       </w:hyperlink>
     </w:p>
-    <w:bookmarkEnd w:id="162"/>
-    <w:bookmarkStart w:id="164" w:name="ref-fournier2012admb"/>
+    <w:bookmarkEnd w:id="166"/>
+    <w:bookmarkStart w:id="168" w:name="ref-fournier2012admb"/>
     <w:p>
       <w:pPr>
         <w:pStyle w:val="Bibliography"/>
@@ -26278,7 +26713,7 @@
       <w:r>
         <w:t xml:space="preserve"> </w:t>
       </w:r>
-      <w:hyperlink r:id="rId163">
+      <w:hyperlink r:id="rId167">
         <w:r>
           <w:rPr>
             <w:rStyle w:val="Hyperlink"/>
@@ -26287,8 +26722,8 @@
         </w:r>
       </w:hyperlink>
     </w:p>
-    <w:bookmarkEnd w:id="164"/>
-    <w:bookmarkStart w:id="166" w:name="ref-fournier1982catchage"/>
+    <w:bookmarkEnd w:id="168"/>
+    <w:bookmarkStart w:id="170" w:name="ref-fournier1982catchage"/>
     <w:p>
       <w:pPr>
         <w:pStyle w:val="Bibliography"/>
@@ -26325,7 +26760,7 @@
       <w:r>
         <w:t xml:space="preserve"> </w:t>
       </w:r>
-      <w:hyperlink r:id="rId165">
+      <w:hyperlink r:id="rId169">
         <w:r>
           <w:rPr>
             <w:rStyle w:val="Hyperlink"/>
@@ -26334,8 +26769,8 @@
         </w:r>
       </w:hyperlink>
     </w:p>
-    <w:bookmarkEnd w:id="166"/>
-    <w:bookmarkStart w:id="168" w:name="ref-francis2011weighting"/>
+    <w:bookmarkEnd w:id="170"/>
+    <w:bookmarkStart w:id="172" w:name="ref-francis2011weighting"/>
     <w:p>
       <w:pPr>
         <w:pStyle w:val="Bibliography"/>
@@ -26372,7 +26807,7 @@
       <w:r>
         <w:t xml:space="preserve"> </w:t>
       </w:r>
-      <w:hyperlink r:id="rId167">
+      <w:hyperlink r:id="rId171">
         <w:r>
           <w:rPr>
             <w:rStyle w:val="Hyperlink"/>
@@ -26381,8 +26816,8 @@
         </w:r>
       </w:hyperlink>
     </w:p>
-    <w:bookmarkEnd w:id="168"/>
-    <w:bookmarkStart w:id="170" w:name="ref-hilborn1992quantitative"/>
+    <w:bookmarkEnd w:id="172"/>
+    <w:bookmarkStart w:id="174" w:name="ref-hilborn1992quantitative"/>
     <w:p>
       <w:pPr>
         <w:pStyle w:val="Bibliography"/>
@@ -26406,7 +26841,7 @@
       <w:r>
         <w:t xml:space="preserve"> </w:t>
       </w:r>
-      <w:hyperlink r:id="rId169">
+      <w:hyperlink r:id="rId173">
         <w:r>
           <w:rPr>
             <w:rStyle w:val="Hyperlink"/>
@@ -26415,8 +26850,8 @@
         </w:r>
       </w:hyperlink>
     </w:p>
-    <w:bookmarkEnd w:id="170"/>
-    <w:bookmarkStart w:id="172" w:name="ref-linton2011selectivity"/>
+    <w:bookmarkEnd w:id="174"/>
+    <w:bookmarkStart w:id="176" w:name="ref-linton2011selectivity"/>
     <w:p>
       <w:pPr>
         <w:pStyle w:val="Bibliography"/>
@@ -26453,7 +26888,7 @@
       <w:r>
         <w:t xml:space="preserve"> </w:t>
       </w:r>
-      <w:hyperlink r:id="rId171">
+      <w:hyperlink r:id="rId175">
         <w:r>
           <w:rPr>
             <w:rStyle w:val="Hyperlink"/>
@@ -26462,8 +26897,8 @@
         </w:r>
       </w:hyperlink>
     </w:p>
-    <w:bookmarkEnd w:id="172"/>
-    <w:bookmarkStart w:id="174" w:name="ref-punt2016bestpractices"/>
+    <w:bookmarkEnd w:id="176"/>
+    <w:bookmarkStart w:id="178" w:name="ref-punt2016bestpractices"/>
     <w:p>
       <w:pPr>
         <w:pStyle w:val="Bibliography"/>
@@ -26500,7 +26935,7 @@
       <w:r>
         <w:t xml:space="preserve"> </w:t>
       </w:r>
-      <w:hyperlink r:id="rId173">
+      <w:hyperlink r:id="rId177">
         <w:r>
           <w:rPr>
             <w:rStyle w:val="Hyperlink"/>
@@ -26509,8 +26944,8 @@
         </w:r>
       </w:hyperlink>
     </w:p>
-    <w:bookmarkEnd w:id="174"/>
-    <w:bookmarkStart w:id="176" w:name="ref-rousseau2019fleets"/>
+    <w:bookmarkEnd w:id="178"/>
+    <w:bookmarkStart w:id="180" w:name="ref-rousseau2019fleets"/>
     <w:p>
       <w:pPr>
         <w:pStyle w:val="Bibliography"/>
@@ -26547,7 +26982,7 @@
       <w:r>
         <w:t xml:space="preserve"> </w:t>
       </w:r>
-      <w:hyperlink r:id="rId175">
+      <w:hyperlink r:id="rId179">
         <w:r>
           <w:rPr>
             <w:rStyle w:val="Hyperlink"/>
@@ -26556,8 +26991,8 @@
         </w:r>
       </w:hyperlink>
     </w:p>
-    <w:bookmarkEnd w:id="176"/>
-    <w:bookmarkStart w:id="178" w:name="ref-schnute1995error"/>
+    <w:bookmarkEnd w:id="180"/>
+    <w:bookmarkStart w:id="182" w:name="ref-schnute1995error"/>
     <w:p>
       <w:pPr>
         <w:pStyle w:val="Bibliography"/>
@@ -26594,7 +27029,7 @@
       <w:r>
         <w:t xml:space="preserve"> </w:t>
       </w:r>
-      <w:hyperlink r:id="rId177">
+      <w:hyperlink r:id="rId181">
         <w:r>
           <w:rPr>
             <w:rStyle w:val="Hyperlink"/>
@@ -26603,8 +27038,8 @@
         </w:r>
       </w:hyperlink>
     </w:p>
-    <w:bookmarkEnd w:id="178"/>
-    <w:bookmarkStart w:id="180" w:name="ref-siple2021smallpelagics"/>
+    <w:bookmarkEnd w:id="182"/>
+    <w:bookmarkStart w:id="184" w:name="ref-siple2021smallpelagics"/>
     <w:p>
       <w:pPr>
         <w:pStyle w:val="Bibliography"/>
@@ -26641,7 +27076,7 @@
       <w:r>
         <w:t xml:space="preserve"> </w:t>
       </w:r>
-      <w:hyperlink r:id="rId179">
+      <w:hyperlink r:id="rId183">
         <w:r>
           <w:rPr>
             <w:rStyle w:val="Hyperlink"/>
@@ -26650,8 +27085,8 @@
         </w:r>
       </w:hyperlink>
     </w:p>
-    <w:bookmarkEnd w:id="180"/>
-    <w:bookmarkStart w:id="182" w:name="ref-sprfmo2025mseworkshop"/>
+    <w:bookmarkEnd w:id="184"/>
+    <w:bookmarkStart w:id="186" w:name="ref-sprfmo2025mseworkshop"/>
     <w:p>
       <w:pPr>
         <w:pStyle w:val="Bibliography"/>
@@ -26720,7 +27155,7 @@
       <w:r>
         <w:t xml:space="preserve"> </w:t>
       </w:r>
-      <w:hyperlink r:id="rId181">
+      <w:hyperlink r:id="rId185">
         <w:r>
           <w:rPr>
             <w:rStyle w:val="Hyperlink"/>
@@ -26729,8 +27164,8 @@
         </w:r>
       </w:hyperlink>
     </w:p>
-    <w:bookmarkEnd w:id="182"/>
-    <w:bookmarkStart w:id="184" w:name="ref-sprfmo2025annex11"/>
+    <w:bookmarkEnd w:id="186"/>
+    <w:bookmarkStart w:id="188" w:name="ref-sprfmo2025annex11"/>
     <w:p>
       <w:pPr>
         <w:pStyle w:val="Bibliography"/>
@@ -26754,7 +27189,7 @@
       <w:r>
         <w:t xml:space="preserve"> </w:t>
       </w:r>
-      <w:hyperlink r:id="rId183">
+      <w:hyperlink r:id="rId187">
         <w:r>
           <w:rPr>
             <w:rStyle w:val="Hyperlink"/>
@@ -26763,9 +27198,9 @@
         </w:r>
       </w:hyperlink>
     </w:p>
-    <w:bookmarkEnd w:id="184"/>
-    <w:bookmarkEnd w:id="185"/>
-    <w:bookmarkEnd w:id="186"/>
+    <w:bookmarkEnd w:id="188"/>
+    <w:bookmarkEnd w:id="189"/>
+    <w:bookmarkEnd w:id="190"/>
     <w:sectPr>
       <w:footnotePr>
         <w:numRestart w:val="eachSect"/>

</xml_diff>

<commit_message>
Update harmonized northern treatment and rebuild site outputs
</commit_message>
<xml_diff>
--- a/docs/SCW16-Paper-01.docx
+++ b/docs/SCW16-Paper-01.docx
@@ -2705,7 +2705,7 @@
       </w:r>
     </w:p>
     <w:bookmarkEnd w:id="37"/>
-    <w:bookmarkStart w:id="154" w:name="proposed-simplified-alternatives"/>
+    <w:bookmarkStart w:id="162" w:name="proposed-simplified-alternatives"/>
     <w:p>
       <w:pPr>
         <w:pStyle w:val="Heading1"/>
@@ -15876,7 +15876,7 @@
     <w:bookmarkEnd w:id="117"/>
     <w:bookmarkEnd w:id="118"/>
     <w:bookmarkEnd w:id="119"/>
-    <w:bookmarkStart w:id="127" w:name="harmonized-northern-treatment"/>
+    <w:bookmarkStart w:id="135" w:name="harmonized-northern-treatment"/>
     <w:p>
       <w:pPr>
         <w:pStyle w:val="Heading2"/>
@@ -16009,6 +16009,24 @@
       </w:r>
       <w:r>
         <w:t xml:space="preserve">to stock structure as opposed to selectivity specification.</w:t>
+      </w:r>
+    </w:p>
+    <w:p>
+      <w:pPr>
+        <w:pStyle w:val="BodyText"/>
+      </w:pPr>
+      <w:r>
+        <w:rPr>
+          <w:b/>
+          <w:bCs/>
+        </w:rPr>
+        <w:t xml:space="preserve">78.</w:t>
+      </w:r>
+      <w:r>
+        <w:t xml:space="preserve"> </w:t>
+      </w:r>
+      <w:r>
+        <w:t xml:space="preserve">Additional input from Peru suggests that the 2002 change should be viewed as the start of a transition in Far North selectivity rather than as a single instantaneous break. A plausible mechanism is the regulatory shift toward direct human consumption (DHC), associated with changes in fleet composition, freezing capacity, mesh size, fishing areas, and school-selection practice. Under that interpretation, 2002-2013 is a transition period with more variable size modes, while 2014-2025 shows a clearer shift toward larger sizes, with a stronger increase from about 2018 onward.</w:t>
       </w:r>
     </w:p>
     <w:tbl>
@@ -16124,7 +16142,7 @@
                 <w:b/>
                 <w:bCs/>
               </w:rPr>
-              <w:t xml:space="preserve">78.</w:t>
+              <w:t xml:space="preserve">79.</w:t>
             </w:r>
             <w:r>
               <w:t xml:space="preserve"> </w:t>
@@ -16255,7 +16273,7 @@
                 <w:b/>
                 <w:bCs/>
               </w:rPr>
-              <w:t xml:space="preserve">79.</w:t>
+              <w:t xml:space="preserve">80.</w:t>
             </w:r>
             <w:r>
               <w:t xml:space="preserve"> </w:t>
@@ -16313,13 +16331,13 @@
           <w:b/>
           <w:bCs/>
         </w:rPr>
-        <w:t xml:space="preserve">80.</w:t>
-      </w:r>
-      <w:r>
-        <w:t xml:space="preserve"> </w:t>
-      </w:r>
-      <w:r>
-        <w:t xml:space="preserve">Implementing the selectivity harmonization will likely require re-fitting</w:t>
+        <w:t xml:space="preserve">81.</w:t>
+      </w:r>
+      <w:r>
+        <w:t xml:space="preserve"> </w:t>
+      </w:r>
+      <w:r>
+        <w:t xml:space="preserve">Taken together, this supports allowing Far North selectivity to vary over time as a more realistic representation than a strict two-regime split centred on 2002 (as in</w:t>
       </w:r>
       <w:r>
         <w:t xml:space="preserve"> </w:t>
@@ -16328,76 +16346,10 @@
         <w:rPr>
           <w:rStyle w:val="VerbatimChar"/>
         </w:rPr>
-        <w:t xml:space="preserve">h1_1.14</w:t>
-      </w:r>
-      <w:r>
-        <w:t xml:space="preserve"> </w:t>
-      </w:r>
-      <w:r>
-        <w:t xml:space="preserve">with</w:t>
-      </w:r>
-      <w:r>
-        <w:t xml:space="preserve"> </w:t>
-      </w:r>
-      <w:r>
-        <w:t xml:space="preserve">a simplified Far North selectivity structure that mirrors the</w:t>
-      </w:r>
-      <w:r>
-        <w:t xml:space="preserve"> </w:t>
-      </w:r>
-      <w:r>
-        <w:rPr>
-          <w:rStyle w:val="VerbatimChar"/>
-        </w:rPr>
-        <w:t xml:space="preserve">h2</w:t>
-      </w:r>
-      <w:r>
-        <w:t xml:space="preserve"> </w:t>
-      </w:r>
-      <w:r>
-        <w:t xml:space="preserve">treatment, or equivalently</w:t>
-      </w:r>
-      <w:r>
-        <w:t xml:space="preserve"> </w:t>
-      </w:r>
-      <w:r>
-        <w:t xml:space="preserve">re-fitting</w:t>
-      </w:r>
-      <w:r>
-        <w:t xml:space="preserve"> </w:t>
-      </w:r>
-      <w:r>
-        <w:rPr>
-          <w:rStyle w:val="VerbatimChar"/>
-        </w:rPr>
         <w:t xml:space="preserve">h2_1.14</w:t>
       </w:r>
       <w:r>
-        <w:t xml:space="preserve"> </w:t>
-      </w:r>
-      <w:r>
-        <w:t xml:space="preserve">with a more flexible Far North selectivity structure analogous to the</w:t>
-      </w:r>
-      <w:r>
-        <w:t xml:space="preserve"> </w:t>
-      </w:r>
-      <w:r>
-        <w:rPr>
-          <w:rStyle w:val="VerbatimChar"/>
-        </w:rPr>
-        <w:t xml:space="preserve">h1</w:t>
-      </w:r>
-      <w:r>
-        <w:t xml:space="preserve"> </w:t>
-      </w:r>
-      <w:r>
-        <w:t xml:space="preserve">treatment. The working group should discuss which direction of harmonization is</w:t>
-      </w:r>
-      <w:r>
-        <w:t xml:space="preserve"> </w:t>
-      </w:r>
-      <w:r>
-        <w:t xml:space="preserve">most defensible given the available data and model diagnostics.</w:t>
+        <w:t xml:space="preserve">). For MSE implementation, a block-based treatment is a practical compromise between realism and tractability. A candidate structure is pre-2002, 2002-2013, and 2014-2025, with an optional additional split near 2018 if diagnostics support it.</w:t>
       </w:r>
     </w:p>
     <w:p>
@@ -16409,7 +16361,7 @@
           <w:b/>
           <w:bCs/>
         </w:rPr>
-        <w:t xml:space="preserve">81.</w:t>
+        <w:t xml:space="preserve">82.</w:t>
       </w:r>
       <w:r>
         <w:t xml:space="preserve"> </w:t>
@@ -16520,10 +16472,13 @@
         <w:t xml:space="preserve"> </w:t>
       </w:r>
       <w:r>
-        <w:t xml:space="preserve">selectivity treatment. The resulting likelihood comparison is shown in</w:t>
-      </w:r>
-      <w:r>
-        <w:t xml:space="preserve"> </w:t>
+        <w:t xml:space="preserve">selectivity treatment. The resulting comparison is assessed using likelihood components</w:t>
+      </w:r>
+      <w:r>
+        <w:t xml:space="preserve"> </w:t>
+      </w:r>
+      <w:r>
+        <w:t xml:space="preserve">(</w:t>
       </w:r>
       <w:hyperlink w:anchor="tbl-north-harmonized-like-components">
         <w:r>
@@ -16534,16 +16489,7 @@
         </w:r>
       </w:hyperlink>
       <w:r>
-        <w:t xml:space="preserve">, and the corresponding retained-index fits are</w:t>
-      </w:r>
-      <w:r>
-        <w:t xml:space="preserve"> </w:t>
-      </w:r>
-      <w:r>
-        <w:t xml:space="preserve">shown in</w:t>
-      </w:r>
-      <w:r>
-        <w:t xml:space="preserve"> </w:t>
+        <w:t xml:space="preserve">), retained-index fits (</w:t>
       </w:r>
       <w:hyperlink w:anchor="fig-harmonized-index-fits">
         <w:r>
@@ -16554,7 +16500,44 @@
         </w:r>
       </w:hyperlink>
       <w:r>
-        <w:t xml:space="preserve">.</w:t>
+        <w:t xml:space="preserve">),</w:t>
+      </w:r>
+      <w:r>
+        <w:t xml:space="preserve"> </w:t>
+      </w:r>
+      <w:r>
+        <w:t xml:space="preserve">and system-level spawning biomass and recruitment trajectories</w:t>
+      </w:r>
+      <w:r>
+        <w:t xml:space="preserve"> </w:t>
+      </w:r>
+      <w:r>
+        <w:t xml:space="preserve">(</w:t>
+      </w:r>
+      <w:hyperlink w:anchor="fig-harmonized-ssb">
+        <w:r>
+          <w:rPr>
+            <w:rStyle w:val="Hyperlink"/>
+          </w:rPr>
+          <w:t xml:space="preserve">Figure 14</w:t>
+        </w:r>
+      </w:hyperlink>
+      <w:r>
+        <w:t xml:space="preserve">;</w:t>
+      </w:r>
+      <w:r>
+        <w:t xml:space="preserve"> </w:t>
+      </w:r>
+      <w:hyperlink w:anchor="fig-harmonized-rec">
+        <w:r>
+          <w:rPr>
+            <w:rStyle w:val="Hyperlink"/>
+          </w:rPr>
+          <w:t xml:space="preserve">Figure 15</w:t>
+        </w:r>
+      </w:hyperlink>
+      <w:r>
+        <w:t xml:space="preserve">).</w:t>
       </w:r>
     </w:p>
     <w:tbl>
@@ -18813,7 +18796,7 @@
           <w:b/>
           <w:bCs/>
         </w:rPr>
-        <w:t xml:space="preserve">82.</w:t>
+        <w:t xml:space="preserve">83.</w:t>
       </w:r>
       <w:r>
         <w:t xml:space="preserve"> </w:t>
@@ -18993,8 +18976,344 @@
         </w:tc>
       </w:tr>
     </w:tbl>
-    <w:bookmarkEnd w:id="127"/>
-    <w:bookmarkStart w:id="142" w:name="simplified-recruitment-alternatives"/>
+    <w:p>
+      <w:pPr>
+        <w:pStyle w:val="BodyText"/>
+      </w:pPr>
+      <w:r>
+        <w:rPr>
+          <w:b/>
+          <w:bCs/>
+        </w:rPr>
+        <w:t xml:space="preserve">84.</w:t>
+      </w:r>
+      <w:r>
+        <w:t xml:space="preserve"> </w:t>
+      </w:r>
+      <w:r>
+        <w:t xml:space="preserve">To complement the likelihood and retained-index diagnostics,</w:t>
+      </w:r>
+      <w:r>
+        <w:t xml:space="preserve"> </w:t>
+      </w:r>
+      <w:hyperlink w:anchor="fig-harmonized-ssb">
+        <w:r>
+          <w:rPr>
+            <w:rStyle w:val="Hyperlink"/>
+          </w:rPr>
+          <w:t xml:space="preserve">Figure 14</w:t>
+        </w:r>
+      </w:hyperlink>
+      <w:r>
+        <w:t xml:space="preserve"> </w:t>
+      </w:r>
+      <w:r>
+        <w:t xml:space="preserve">and</w:t>
+      </w:r>
+      <w:r>
+        <w:t xml:space="preserve"> </w:t>
+      </w:r>
+      <w:hyperlink w:anchor="fig-harmonized-rec">
+        <w:r>
+          <w:rPr>
+            <w:rStyle w:val="Hyperlink"/>
+          </w:rPr>
+          <w:t xml:space="preserve">Figure 15</w:t>
+        </w:r>
+      </w:hyperlink>
+      <w:r>
+        <w:t xml:space="preserve"> </w:t>
+      </w:r>
+      <w:r>
+        <w:t xml:space="preserve">compare the fitted system-level spawning biomass and recruitment</w:t>
+      </w:r>
+      <w:r>
+        <w:t xml:space="preserve"> </w:t>
+      </w:r>
+      <w:r>
+        <w:t xml:space="preserve">trajectories across the same three models. For</w:t>
+      </w:r>
+      <w:r>
+        <w:t xml:space="preserve"> </w:t>
+      </w:r>
+      <w:r>
+        <w:rPr>
+          <w:rStyle w:val="VerbatimChar"/>
+        </w:rPr>
+        <w:t xml:space="preserve">h2_2.02</w:t>
+      </w:r>
+      <w:r>
+        <w:t xml:space="preserve">, the plotted values are the sum</w:t>
+      </w:r>
+      <w:r>
+        <w:t xml:space="preserve"> </w:t>
+      </w:r>
+      <w:r>
+        <w:t xml:space="preserve">across the two modeled stocks so that the trajectories are directly comparable with</w:t>
+      </w:r>
+      <w:r>
+        <w:t xml:space="preserve"> </w:t>
+      </w:r>
+      <w:r>
+        <w:t xml:space="preserve">the single-stock runs.</w:t>
+      </w:r>
+    </w:p>
+    <w:tbl>
+      <w:tblPr>
+        <w:tblStyle w:val="Table"/>
+        <w:tblW w:type="pct" w:w="5000"/>
+        <w:tblLayout w:type="fixed"/>
+        <w:tblLook w:firstRow="0" w:lastRow="0" w:firstColumn="0" w:lastColumn="0" w:noHBand="0" w:noVBand="0" w:val="0000"/>
+      </w:tblPr>
+      <w:tblGrid>
+        <w:gridCol w:w="7920"/>
+      </w:tblGrid>
+      <w:tr>
+        <w:tc>
+          <w:tcPr/>
+          <w:bookmarkStart w:id="130" w:name="fig-harmonized-ssb"/>
+          <w:p>
+            <w:pPr>
+              <w:pStyle w:val="Compact"/>
+              <w:jc w:val="center"/>
+            </w:pPr>
+            <w:r>
+              <w:drawing>
+                <wp:inline>
+                  <wp:extent cx="5334000" cy="3194843"/>
+                  <wp:effectExtent b="0" l="0" r="0" t="0"/>
+                  <wp:docPr descr="" title="" id="128" name="Picture"/>
+                  <a:graphic>
+                    <a:graphicData uri="http://schemas.openxmlformats.org/drawingml/2006/picture">
+                      <pic:pic>
+                        <pic:nvPicPr>
+                          <pic:cNvPr descr="SCW16-Paper-01_files/figure-docx/fig-harmonized-ssb-1.png" id="129" name="Picture"/>
+                          <pic:cNvPicPr>
+                            <a:picLocks noChangeArrowheads="1" noChangeAspect="1"/>
+                          </pic:cNvPicPr>
+                        </pic:nvPicPr>
+                        <pic:blipFill>
+                          <a:blip r:embed="rId127"/>
+                          <a:stretch>
+                            <a:fillRect/>
+                          </a:stretch>
+                        </pic:blipFill>
+                        <pic:spPr bwMode="auto">
+                          <a:xfrm>
+                            <a:off x="0" y="0"/>
+                            <a:ext cx="5334000" cy="3194843"/>
+                          </a:xfrm>
+                          <a:prstGeom prst="rect">
+                            <a:avLst/>
+                          </a:prstGeom>
+                          <a:noFill/>
+                          <a:ln w="9525">
+                            <a:noFill/>
+                            <a:headEnd/>
+                            <a:tailEnd/>
+                          </a:ln>
+                        </pic:spPr>
+                      </pic:pic>
+                    </a:graphicData>
+                  </a:graphic>
+                </wp:inline>
+              </w:drawing>
+            </w:r>
+          </w:p>
+          <w:p>
+            <w:pPr>
+              <w:jc w:val="center"/>
+            </w:pPr>
+            <w:pPr>
+              <w:jc w:val="left"/>
+              <w:spacing w:before="200"/>
+              <w:pStyle w:val="ImageCaption"/>
+            </w:pPr>
+            <w:r>
+              <w:t xml:space="preserve">Figure 14: System-level spawning biomass trajectories for</w:t>
+            </w:r>
+            <w:r>
+              <w:t xml:space="preserve"> </w:t>
+            </w:r>
+            <w:r>
+              <w:rPr>
+                <w:rStyle w:val="VerbatimChar"/>
+              </w:rPr>
+              <w:t xml:space="preserve">h1_2.00</w:t>
+            </w:r>
+            <w:r>
+              <w:t xml:space="preserve">,</w:t>
+            </w:r>
+            <w:r>
+              <w:t xml:space="preserve"> </w:t>
+            </w:r>
+            <w:r>
+              <w:rPr>
+                <w:rStyle w:val="VerbatimChar"/>
+              </w:rPr>
+              <w:t xml:space="preserve">h1_2.02</w:t>
+            </w:r>
+            <w:r>
+              <w:t xml:space="preserve">, and</w:t>
+            </w:r>
+            <w:r>
+              <w:t xml:space="preserve"> </w:t>
+            </w:r>
+            <w:r>
+              <w:rPr>
+                <w:rStyle w:val="VerbatimChar"/>
+              </w:rPr>
+              <w:t xml:space="preserve">h2_2.02</w:t>
+            </w:r>
+            <w:r>
+              <w:t xml:space="preserve">. For</w:t>
+            </w:r>
+            <w:r>
+              <w:t xml:space="preserve"> </w:t>
+            </w:r>
+            <w:r>
+              <w:rPr>
+                <w:rStyle w:val="VerbatimChar"/>
+              </w:rPr>
+              <w:t xml:space="preserve">h2_2.02</w:t>
+            </w:r>
+            <w:r>
+              <w:t xml:space="preserve">, values are the sum of stock-1 and stock-2 spawning biomass.</w:t>
+            </w:r>
+          </w:p>
+          <w:bookmarkEnd w:id="130"/>
+        </w:tc>
+      </w:tr>
+    </w:tbl>
+    <w:tbl>
+      <w:tblPr>
+        <w:tblStyle w:val="Table"/>
+        <w:tblW w:type="pct" w:w="5000"/>
+        <w:tblLayout w:type="fixed"/>
+        <w:tblLook w:firstRow="0" w:lastRow="0" w:firstColumn="0" w:lastColumn="0" w:noHBand="0" w:noVBand="0" w:val="0000"/>
+      </w:tblPr>
+      <w:tblGrid>
+        <w:gridCol w:w="7920"/>
+      </w:tblGrid>
+      <w:tr>
+        <w:tc>
+          <w:tcPr/>
+          <w:bookmarkStart w:id="134" w:name="fig-harmonized-rec"/>
+          <w:p>
+            <w:pPr>
+              <w:pStyle w:val="Compact"/>
+              <w:jc w:val="center"/>
+            </w:pPr>
+            <w:r>
+              <w:drawing>
+                <wp:inline>
+                  <wp:extent cx="5334000" cy="3194843"/>
+                  <wp:effectExtent b="0" l="0" r="0" t="0"/>
+                  <wp:docPr descr="" title="" id="132" name="Picture"/>
+                  <a:graphic>
+                    <a:graphicData uri="http://schemas.openxmlformats.org/drawingml/2006/picture">
+                      <pic:pic>
+                        <pic:nvPicPr>
+                          <pic:cNvPr descr="SCW16-Paper-01_files/figure-docx/fig-harmonized-rec-1.png" id="133" name="Picture"/>
+                          <pic:cNvPicPr>
+                            <a:picLocks noChangeArrowheads="1" noChangeAspect="1"/>
+                          </pic:cNvPicPr>
+                        </pic:nvPicPr>
+                        <pic:blipFill>
+                          <a:blip r:embed="rId131"/>
+                          <a:stretch>
+                            <a:fillRect/>
+                          </a:stretch>
+                        </pic:blipFill>
+                        <pic:spPr bwMode="auto">
+                          <a:xfrm>
+                            <a:off x="0" y="0"/>
+                            <a:ext cx="5334000" cy="3194843"/>
+                          </a:xfrm>
+                          <a:prstGeom prst="rect">
+                            <a:avLst/>
+                          </a:prstGeom>
+                          <a:noFill/>
+                          <a:ln w="9525">
+                            <a:noFill/>
+                            <a:headEnd/>
+                            <a:tailEnd/>
+                          </a:ln>
+                        </pic:spPr>
+                      </pic:pic>
+                    </a:graphicData>
+                  </a:graphic>
+                </wp:inline>
+              </w:drawing>
+            </w:r>
+          </w:p>
+          <w:p>
+            <w:pPr>
+              <w:jc w:val="center"/>
+            </w:pPr>
+            <w:pPr>
+              <w:jc w:val="left"/>
+              <w:spacing w:before="200"/>
+              <w:pStyle w:val="ImageCaption"/>
+            </w:pPr>
+            <w:r>
+              <w:t xml:space="preserve">Figure 15: System-level recruitment trajectories for</w:t>
+            </w:r>
+            <w:r>
+              <w:t xml:space="preserve"> </w:t>
+            </w:r>
+            <w:r>
+              <w:rPr>
+                <w:rStyle w:val="VerbatimChar"/>
+              </w:rPr>
+              <w:t xml:space="preserve">h1_2.00</w:t>
+            </w:r>
+            <w:r>
+              <w:t xml:space="preserve">,</w:t>
+            </w:r>
+            <w:r>
+              <w:t xml:space="preserve"> </w:t>
+            </w:r>
+            <w:r>
+              <w:rPr>
+                <w:rStyle w:val="VerbatimChar"/>
+              </w:rPr>
+              <w:t xml:space="preserve">h1_2.02</w:t>
+            </w:r>
+            <w:r>
+              <w:t xml:space="preserve">, and</w:t>
+            </w:r>
+            <w:r>
+              <w:t xml:space="preserve"> </w:t>
+            </w:r>
+            <w:r>
+              <w:rPr>
+                <w:rStyle w:val="VerbatimChar"/>
+              </w:rPr>
+              <w:t xml:space="preserve">h2_2.02</w:t>
+            </w:r>
+            <w:r>
+              <w:t xml:space="preserve">. For</w:t>
+            </w:r>
+            <w:r>
+              <w:t xml:space="preserve"> </w:t>
+            </w:r>
+            <w:r>
+              <w:rPr>
+                <w:rStyle w:val="VerbatimChar"/>
+              </w:rPr>
+              <w:t xml:space="preserve">h2_2.02</w:t>
+            </w:r>
+            <w:r>
+              <w:t xml:space="preserve">, values are the sum of stock-1 and stock-2 recruitment.</w:t>
+            </w:r>
+          </w:p>
+          <w:bookmarkEnd w:id="134"/>
+        </w:tc>
+      </w:tr>
+    </w:tbl>
+    <w:bookmarkEnd w:id="135"/>
+    <w:bookmarkStart w:id="150" w:name="simplified-recruitment-alternatives"/>
     <w:p>
       <w:pPr>
         <w:pStyle w:val="Heading2"/>
@@ -19012,7 +19331,7 @@
           <w:b/>
           <w:bCs/>
         </w:rPr>
-        <w:t xml:space="preserve">83.</w:t>
+        <w:t xml:space="preserve">85.</w:t>
       </w:r>
       <w:r>
         <w:t xml:space="preserve"> </w:t>
@@ -19092,12 +19411,12 @@
                 <wp:inline>
                   <wp:extent cx="152400" cy="152400"/>
                   <wp:effectExtent b="0" l="0" r="0" t="0"/>
-                  <wp:docPr descr="" title="" id="128" name="Picture"/>
+                  <wp:docPr descr="" title="" id="136" name="Picture"/>
                   <a:graphic>
                     <a:graphicData uri="http://schemas.openxmlformats.org/drawingml/2006/picture">
                       <pic:pic>
                         <pic:nvPicPr>
-                          <pic:cNvPr descr="/Applications/quarto/share/formats/docx/note.png" id="129" name="Picture"/>
+                          <pic:cNvPr descr="/Applications/quarto/share/formats/docx/note.png" id="137" name="Picture"/>
                           <pic:cNvPicPr>
                             <a:picLocks noChangeArrowheads="1" noChangeAspect="1"/>
                           </pic:cNvPicPr>
@@ -19164,7 +19483,7 @@
                 <w:b/>
                 <w:bCs/>
               </w:rPr>
-              <w:t xml:space="preserve">84.</w:t>
+              <w:t xml:space="preserve">86.</w:t>
             </w:r>
             <w:r>
               <w:t xml:space="preserve"> </w:t>
@@ -19197,7 +19516,7 @@
                 <w:b/>
                 <w:bCs/>
               </w:rPr>
-              <w:t xml:space="preserve">85.</w:t>
+              <w:t xml:space="preserve">87.</w:t>
             </w:r>
             <w:r>
               <w:t xml:space="preserve"> </w:t>
@@ -19219,7 +19538,7 @@
           <w:b/>
           <w:bCs/>
         </w:rPr>
-        <w:t xml:space="preserve">86.</w:t>
+        <w:t xml:space="preserve">88.</w:t>
       </w:r>
       <w:r>
         <w:t xml:space="preserve"> </w:t>
@@ -19304,7 +19623,7 @@
           <w:rPr>
             <w:rStyle w:val="Hyperlink"/>
           </w:rPr>
-          <w:t xml:space="preserve">Figure 14</w:t>
+          <w:t xml:space="preserve">Figure 16</w:t>
         </w:r>
       </w:hyperlink>
       <w:r>
@@ -19324,7 +19643,7 @@
       <w:tr>
         <w:tc>
           <w:tcPr/>
-          <w:bookmarkStart w:id="133" w:name="fig-h2-sr-compare"/>
+          <w:bookmarkStart w:id="141" w:name="fig-h2-sr-compare"/>
           <w:p>
             <w:pPr>
               <w:pStyle w:val="Compact"/>
@@ -19335,18 +19654,18 @@
                 <wp:inline>
                   <wp:extent cx="5334000" cy="3194843"/>
                   <wp:effectExtent b="0" l="0" r="0" t="0"/>
-                  <wp:docPr descr="" title="" id="131" name="Picture"/>
+                  <wp:docPr descr="" title="" id="139" name="Picture"/>
                   <a:graphic>
                     <a:graphicData uri="http://schemas.openxmlformats.org/drawingml/2006/picture">
                       <pic:pic>
                         <pic:nvPicPr>
-                          <pic:cNvPr descr="SCW16-Paper-01_files/figure-docx/fig-h2-sr-compare-1.png" id="132" name="Picture"/>
+                          <pic:cNvPr descr="SCW16-Paper-01_files/figure-docx/fig-h2-sr-compare-1.png" id="140" name="Picture"/>
                           <pic:cNvPicPr>
                             <a:picLocks noChangeArrowheads="1" noChangeAspect="1"/>
                           </pic:cNvPicPr>
                         </pic:nvPicPr>
                         <pic:blipFill>
-                          <a:blip r:embed="rId130"/>
+                          <a:blip r:embed="rId138"/>
                           <a:stretch>
                             <a:fillRect/>
                           </a:stretch>
@@ -19383,7 +19702,7 @@
               <w:pStyle w:val="ImageCaption"/>
             </w:pPr>
             <w:r>
-              <w:t xml:space="preserve">Figure 14: Stock-2 Beverton-Holt stock-recruitment curves for</w:t>
+              <w:t xml:space="preserve">Figure 16: Stock-2 Beverton-Holt stock-recruitment curves for</w:t>
             </w:r>
             <w:r>
               <w:t xml:space="preserve"> </w:t>
@@ -19437,7 +19756,7 @@
               <w:t xml:space="preserve">.</w:t>
             </w:r>
           </w:p>
-          <w:bookmarkEnd w:id="133"/>
+          <w:bookmarkEnd w:id="141"/>
         </w:tc>
       </w:tr>
     </w:tbl>
@@ -19450,7 +19769,7 @@
           <w:b/>
           <w:bCs/>
         </w:rPr>
-        <w:t xml:space="preserve">87.</w:t>
+        <w:t xml:space="preserve">89.</w:t>
       </w:r>
       <w:r>
         <w:t xml:space="preserve"> </w:t>
@@ -19547,7 +19866,7 @@
           <w:rPr>
             <w:rStyle w:val="Hyperlink"/>
           </w:rPr>
-          <w:t xml:space="preserve">Figure 14</w:t>
+          <w:t xml:space="preserve">Figure 16</w:t>
         </w:r>
       </w:hyperlink>
       <w:r>
@@ -19581,7 +19900,7 @@
           <w:b/>
           <w:bCs/>
         </w:rPr>
-        <w:t xml:space="preserve">88.</w:t>
+        <w:t xml:space="preserve">90.</w:t>
       </w:r>
       <w:r>
         <w:t xml:space="preserve"> </w:t>
@@ -19597,7 +19916,7 @@
           <w:rPr>
             <w:rStyle w:val="Hyperlink"/>
           </w:rPr>
-          <w:t xml:space="preserve">Figure 15</w:t>
+          <w:t xml:space="preserve">Figure 17</w:t>
         </w:r>
       </w:hyperlink>
       <w:r>
@@ -19623,7 +19942,7 @@
           <w:rPr>
             <w:rStyle w:val="Hyperlink"/>
           </w:rPr>
-          <w:t xml:space="preserve">Figure 16</w:t>
+          <w:t xml:space="preserve">Figure 18</w:t>
         </w:r>
       </w:hyperlink>
       <w:r>
@@ -19643,7 +19962,7 @@
       <w:tr>
         <w:tc>
           <w:tcPr/>
-          <w:bookmarkStart w:id="137" w:name="fig-h2-stock2-ssb"/>
+          <w:bookmarkStart w:id="145" w:name="fig-h2-stock2-ssb"/>
           <w:p>
             <w:pPr>
               <w:pStyle w:val="Compact"/>
@@ -19654,18 +19973,18 @@
                 <wp:inline>
                   <wp:extent cx="5334000" cy="3062882"/>
                   <wp:effectExtent b="0" l="0" r="0" t="0"/>
-                  <wp:docPr descr="" title="" id="135" name="Picture"/>
+                  <wp:docPr descr="" title="" id="143" name="Picture"/>
                   <a:graphic>
                     <a:graphicData uri="http://schemas.openxmlformats.org/drawingml/2006/picture">
                       <pic:pic>
                         <pic:nvPicPr>
-                          <pic:cNvPr descr="SCW16-Paper-01_files/figure-docx/fig-h2-stock2-ssb-1.png" id="136" name="Picture"/>
+                          <pic:cNvPr descr="SCW16-Paper-01_files/figure-docx/fig-h2-stock2-ssb-1.png" id="144" name="Picture"/>
                           <pic:cNvPicPr>
                             <a:picLocks noChangeArrowheads="1" noChangeAspect="1"/>
                           </pic:cNvPicPr>
                         </pic:nvPicPr>
                         <pic:blipFill>
-                          <a:blip r:embed="rId134"/>
+                          <a:blip r:embed="rId142"/>
                           <a:stretch>
                             <a:fillRect/>
                           </a:stretch>
@@ -19702,7 +20021,7 @@
               <w:pStyle w:val="ImageCaption"/>
             </w:pPr>
             <w:r>
-              <w:t xml:space="preserve">Figure 15: Estimated stock-2 spawning biomass trajectories for</w:t>
+              <w:t xml:space="preserve">Figure 17: Estimated stock-2 spawning biomass trajectories for</w:t>
             </w:r>
             <w:r>
               <w:t xml:space="preserve"> </w:t>
@@ -19732,7 +20051,7 @@
               <w:t xml:space="preserve">.</w:t>
             </w:r>
           </w:p>
-          <w:bookmarkEnd w:id="137"/>
+          <w:bookmarkEnd w:id="145"/>
         </w:tc>
       </w:tr>
     </w:tbl>
@@ -19749,7 +20068,7 @@
       <w:tr>
         <w:tc>
           <w:tcPr/>
-          <w:bookmarkStart w:id="141" w:name="fig-h2-stock2-rec"/>
+          <w:bookmarkStart w:id="149" w:name="fig-h2-stock2-rec"/>
           <w:p>
             <w:pPr>
               <w:pStyle w:val="Compact"/>
@@ -19760,18 +20079,18 @@
                 <wp:inline>
                   <wp:extent cx="5334000" cy="3062882"/>
                   <wp:effectExtent b="0" l="0" r="0" t="0"/>
-                  <wp:docPr descr="" title="" id="139" name="Picture"/>
+                  <wp:docPr descr="" title="" id="147" name="Picture"/>
                   <a:graphic>
                     <a:graphicData uri="http://schemas.openxmlformats.org/drawingml/2006/picture">
                       <pic:pic>
                         <pic:nvPicPr>
-                          <pic:cNvPr descr="SCW16-Paper-01_files/figure-docx/fig-h2-stock2-rec-1.png" id="140" name="Picture"/>
+                          <pic:cNvPr descr="SCW16-Paper-01_files/figure-docx/fig-h2-stock2-rec-1.png" id="148" name="Picture"/>
                           <pic:cNvPicPr>
                             <a:picLocks noChangeArrowheads="1" noChangeAspect="1"/>
                           </pic:cNvPicPr>
                         </pic:nvPicPr>
                         <pic:blipFill>
-                          <a:blip r:embed="rId138"/>
+                          <a:blip r:embed="rId146"/>
                           <a:stretch>
                             <a:fillRect/>
                           </a:stretch>
@@ -19808,7 +20127,7 @@
               <w:pStyle w:val="ImageCaption"/>
             </w:pPr>
             <w:r>
-              <w:t xml:space="preserve">Figure 16: Estimated stock-2 recruitment trajectories for</w:t>
+              <w:t xml:space="preserve">Figure 18: Estimated stock-2 recruitment trajectories for</w:t>
             </w:r>
             <w:r>
               <w:t xml:space="preserve"> </w:t>
@@ -19838,12 +20157,12 @@
               <w:t xml:space="preserve">.</w:t>
             </w:r>
           </w:p>
-          <w:bookmarkEnd w:id="141"/>
+          <w:bookmarkEnd w:id="149"/>
         </w:tc>
       </w:tr>
     </w:tbl>
-    <w:bookmarkEnd w:id="142"/>
-    <w:bookmarkStart w:id="153" w:name="fixed-reference-point-alternatives"/>
+    <w:bookmarkEnd w:id="150"/>
+    <w:bookmarkStart w:id="161" w:name="fixed-reference-point-alternatives"/>
     <w:p>
       <w:pPr>
         <w:pStyle w:val="Heading2"/>
@@ -19861,7 +20180,7 @@
           <w:b/>
           <w:bCs/>
         </w:rPr>
-        <w:t xml:space="preserve">89.</w:t>
+        <w:t xml:space="preserve">91.</w:t>
       </w:r>
       <w:r>
         <w:t xml:space="preserve"> </w:t>
@@ -19897,7 +20216,7 @@
           <w:b/>
           <w:bCs/>
         </w:rPr>
-        <w:t xml:space="preserve">90.</w:t>
+        <w:t xml:space="preserve">92.</w:t>
       </w:r>
       <w:r>
         <w:t xml:space="preserve"> </w:t>
@@ -20003,7 +20322,7 @@
           <w:b/>
           <w:bCs/>
         </w:rPr>
-        <w:t xml:space="preserve">91.</w:t>
+        <w:t xml:space="preserve">93.</w:t>
       </w:r>
       <w:r>
         <w:t xml:space="preserve"> </w:t>
@@ -20258,7 +20577,7 @@
           <w:rPr>
             <w:rStyle w:val="Hyperlink"/>
           </w:rPr>
-          <w:t xml:space="preserve">Figure 17</w:t>
+          <w:t xml:space="preserve">Figure 19</w:t>
         </w:r>
       </w:hyperlink>
       <w:r>
@@ -20278,7 +20597,7 @@
       <w:tr>
         <w:tc>
           <w:tcPr/>
-          <w:bookmarkStart w:id="146" w:name="fig-mean-selected-age"/>
+          <w:bookmarkStart w:id="154" w:name="fig-mean-selected-age"/>
           <w:p>
             <w:pPr>
               <w:pStyle w:val="Compact"/>
@@ -20289,18 +20608,18 @@
                 <wp:inline>
                   <wp:extent cx="5334000" cy="3062882"/>
                   <wp:effectExtent b="0" l="0" r="0" t="0"/>
-                  <wp:docPr descr="" title="" id="144" name="Picture"/>
+                  <wp:docPr descr="" title="" id="152" name="Picture"/>
                   <a:graphic>
                     <a:graphicData uri="http://schemas.openxmlformats.org/drawingml/2006/picture">
                       <pic:pic>
                         <pic:nvPicPr>
-                          <pic:cNvPr descr="SCW16-Paper-01_files/figure-docx/fig-mean-selected-age-1.png" id="145" name="Picture"/>
+                          <pic:cNvPr descr="SCW16-Paper-01_files/figure-docx/fig-mean-selected-age-1.png" id="153" name="Picture"/>
                           <pic:cNvPicPr>
                             <a:picLocks noChangeArrowheads="1" noChangeAspect="1"/>
                           </pic:cNvPicPr>
                         </pic:nvPicPr>
                         <pic:blipFill>
-                          <a:blip r:embed="rId143"/>
+                          <a:blip r:embed="rId151"/>
                           <a:stretch>
                             <a:fillRect/>
                           </a:stretch>
@@ -20337,7 +20656,7 @@
               <w:pStyle w:val="ImageCaption"/>
             </w:pPr>
             <w:r>
-              <w:t xml:space="preserve">Figure 17: Time trend in fishery-combined mean selected age for</w:t>
+              <w:t xml:space="preserve">Figure 19: Time trend in fishery-combined mean selected age for</w:t>
             </w:r>
             <w:r>
               <w:t xml:space="preserve"> </w:t>
@@ -20512,7 +20831,7 @@
               <w:t xml:space="preserve">.</w:t>
             </w:r>
           </w:p>
-          <w:bookmarkEnd w:id="146"/>
+          <w:bookmarkEnd w:id="154"/>
         </w:tc>
       </w:tr>
     </w:tbl>
@@ -20525,7 +20844,7 @@
           <w:b/>
           <w:bCs/>
         </w:rPr>
-        <w:t xml:space="preserve">92.</w:t>
+        <w:t xml:space="preserve">94.</w:t>
       </w:r>
       <w:r>
         <w:t xml:space="preserve"> </w:t>
@@ -20615,7 +20934,7 @@
           <w:b/>
           <w:bCs/>
         </w:rPr>
-        <w:t xml:space="preserve">93.</w:t>
+        <w:t xml:space="preserve">95.</w:t>
       </w:r>
       <w:r>
         <w:t xml:space="preserve"> </w:t>
@@ -20660,7 +20979,7 @@
           <w:rPr>
             <w:rStyle w:val="Hyperlink"/>
           </w:rPr>
-          <w:t xml:space="preserve">Figure 18</w:t>
+          <w:t xml:space="preserve">Figure 20</w:t>
         </w:r>
       </w:hyperlink>
       <w:r>
@@ -20709,7 +21028,7 @@
       <w:tr>
         <w:tc>
           <w:tcPr/>
-          <w:bookmarkStart w:id="150" w:name="fig-mean-selected-age-fmsy"/>
+          <w:bookmarkStart w:id="158" w:name="fig-mean-selected-age-fmsy"/>
           <w:p>
             <w:pPr>
               <w:pStyle w:val="Compact"/>
@@ -20720,18 +21039,18 @@
                 <wp:inline>
                   <wp:extent cx="5334000" cy="4000500"/>
                   <wp:effectExtent b="0" l="0" r="0" t="0"/>
-                  <wp:docPr descr="" title="" id="148" name="Picture"/>
+                  <wp:docPr descr="" title="" id="156" name="Picture"/>
                   <a:graphic>
                     <a:graphicData uri="http://schemas.openxmlformats.org/drawingml/2006/picture">
                       <pic:pic>
                         <pic:nvPicPr>
-                          <pic:cNvPr descr="SCW16-Paper-01_files/figure-docx/fig-mean-selected-age-fmsy-1.png" id="149" name="Picture"/>
+                          <pic:cNvPr descr="SCW16-Paper-01_files/figure-docx/fig-mean-selected-age-fmsy-1.png" id="157" name="Picture"/>
                           <pic:cNvPicPr>
                             <a:picLocks noChangeArrowheads="1" noChangeAspect="1"/>
                           </pic:cNvPicPr>
                         </pic:nvPicPr>
                         <pic:blipFill>
-                          <a:blip r:embed="rId147"/>
+                          <a:blip r:embed="rId155"/>
                           <a:stretch>
                             <a:fillRect/>
                           </a:stretch>
@@ -20768,7 +21087,7 @@
               <w:pStyle w:val="ImageCaption"/>
             </w:pPr>
             <w:r>
-              <w:t xml:space="preserve">Figure 18: Relationship between mean selected age (x-axis) and dynamic</w:t>
+              <w:t xml:space="preserve">Figure 20: Relationship between mean selected age (x-axis) and dynamic</w:t>
             </w:r>
             <w:r>
               <w:t xml:space="preserve"> </w:t>
@@ -20848,7 +21167,7 @@
               <w:t xml:space="preserve">. Points are colored by year and labeled with year.</w:t>
             </w:r>
           </w:p>
-          <w:bookmarkEnd w:id="150"/>
+          <w:bookmarkEnd w:id="158"/>
         </w:tc>
       </w:tr>
     </w:tbl>
@@ -20893,12 +21212,12 @@
                 <wp:inline>
                   <wp:extent cx="152400" cy="152400"/>
                   <wp:effectExtent b="0" l="0" r="0" t="0"/>
-                  <wp:docPr descr="" title="" id="151" name="Picture"/>
+                  <wp:docPr descr="" title="" id="159" name="Picture"/>
                   <a:graphic>
                     <a:graphicData uri="http://schemas.openxmlformats.org/drawingml/2006/picture">
                       <pic:pic>
                         <pic:nvPicPr>
-                          <pic:cNvPr descr="/Applications/quarto/share/formats/docx/note.png" id="152" name="Picture"/>
+                          <pic:cNvPr descr="/Applications/quarto/share/formats/docx/note.png" id="160" name="Picture"/>
                           <pic:cNvPicPr>
                             <a:picLocks noChangeArrowheads="1" noChangeAspect="1"/>
                           </pic:cNvPicPr>
@@ -20965,7 +21284,7 @@
                 <w:b/>
                 <w:bCs/>
               </w:rPr>
-              <w:t xml:space="preserve">94.</w:t>
+              <w:t xml:space="preserve">96.</w:t>
             </w:r>
             <w:r>
               <w:t xml:space="preserve"> </w:t>
@@ -21097,7 +21416,7 @@
           <w:b/>
           <w:bCs/>
         </w:rPr>
-        <w:t xml:space="preserve">95.</w:t>
+        <w:t xml:space="preserve">97.</w:t>
       </w:r>
       <w:r>
         <w:t xml:space="preserve"> </w:t>
@@ -21106,9 +21425,9 @@
         <w:t xml:space="preserve">The recommended approach is therefore to calculate reference points once, using the terminal selectivity block and the current biological schedules, and use those fixed values as management benchmarks throughout the MSE simulation. Sensitivity to the choice of reference period can be examined as part of robustness testing.</w:t>
       </w:r>
     </w:p>
-    <w:bookmarkEnd w:id="153"/>
-    <w:bookmarkEnd w:id="154"/>
-    <w:bookmarkStart w:id="155" w:name="summary"/>
+    <w:bookmarkEnd w:id="161"/>
+    <w:bookmarkEnd w:id="162"/>
+    <w:bookmarkStart w:id="163" w:name="summary"/>
     <w:p>
       <w:pPr>
         <w:pStyle w:val="Heading1"/>
@@ -21126,7 +21445,7 @@
           <w:b/>
           <w:bCs/>
         </w:rPr>
-        <w:t xml:space="preserve">96.</w:t>
+        <w:t xml:space="preserve">98.</w:t>
       </w:r>
       <w:r>
         <w:t xml:space="preserve"> </w:t>
@@ -21440,7 +21759,7 @@
           <w:b/>
           <w:bCs/>
         </w:rPr>
-        <w:t xml:space="preserve">.</w:t>
+        <w:t xml:space="preserve">, and should be judged on dynamics as well as fit.</w:t>
       </w:r>
       <w:r>
         <w:t xml:space="preserve"> </w:t>
@@ -21488,7 +21807,7 @@
         <w:t xml:space="preserve"> </w:t>
       </w:r>
       <w:r>
-        <w:t xml:space="preserve">provides a cleaner two-stock comparator because it uses the same reduced-index data treatment and a similar simplified Far North selectivity structure. That makes the</w:t>
+        <w:t xml:space="preserve">provides a cleaner two-stock comparator because it uses the same reduced-index data treatment and aligned Far North selectivity structure. The</w:t>
       </w:r>
       <w:r>
         <w:t xml:space="preserve"> </w:t>
@@ -21518,7 +21837,7 @@
         <w:t xml:space="preserve"> </w:t>
       </w:r>
       <w:r>
-        <w:t xml:space="preserve">comparison easier to interpret as a stock-structure contrast rather than a selectivity-regularization contrast.</w:t>
+        <w:t xml:space="preserve">contrast should therefore be interpreted using likelihoods together with spawning biomass and recruitment trajectories, not likelihoods alone.</w:t>
       </w:r>
     </w:p>
     <w:p>
@@ -21921,7 +22240,7 @@
           <w:b/>
           <w:bCs/>
         </w:rPr>
-        <w:t xml:space="preserve">97.</w:t>
+        <w:t xml:space="preserve">99.</w:t>
       </w:r>
       <w:r>
         <w:t xml:space="preserve"> </w:t>
@@ -21930,8 +22249,8 @@
         <w:t xml:space="preserve">Taken together, these results suggest that the next stage should focus less on broad additional simplification and more on selecting a compact set of well-motivated operating models and robustness scenarios. The current evidence points toward carrying forward a reduced-index baseline, a single-stock model that preserves South-Central Chile selectivity flexibility, a harmonized two-stock comparator, and targeted robustness cases for q variability, projection selectivity, and alternative stock-2 recruitment structure.</w:t>
       </w:r>
     </w:p>
-    <w:bookmarkEnd w:id="155"/>
-    <w:bookmarkStart w:id="165" w:name="appendix-compact-equation-summary"/>
+    <w:bookmarkEnd w:id="163"/>
+    <w:bookmarkStart w:id="173" w:name="appendix-compact-equation-summary"/>
     <w:p>
       <w:pPr>
         <w:pStyle w:val="Heading1"/>
@@ -21948,7 +22267,7 @@
         <w:t xml:space="preserve">This appendix gives a compact schematic description of the equations underlying the SC13 Joint Jack Mackerel Model. It is intended to summarize the structure used in this working paper rather than to reproduce every implementation detail of the ADMB code or every option described in the technical annex and user guide.</w:t>
       </w:r>
     </w:p>
-    <w:bookmarkStart w:id="156" w:name="notation"/>
+    <w:bookmarkStart w:id="164" w:name="notation"/>
     <w:p>
       <w:pPr>
         <w:pStyle w:val="Heading2"/>
@@ -22538,8 +22857,8 @@
         <w:t xml:space="preserve">.</w:t>
       </w:r>
     </w:p>
-    <w:bookmarkEnd w:id="156"/>
-    <w:bookmarkStart w:id="157" w:name="population-update"/>
+    <w:bookmarkEnd w:id="164"/>
+    <w:bookmarkStart w:id="165" w:name="population-update"/>
     <w:p>
       <w:pPr>
         <w:pStyle w:val="Heading2"/>
@@ -23547,8 +23866,8 @@
         <w:t xml:space="preserve">is the fraction of annual mortality occurring before spawning.</w:t>
       </w:r>
     </w:p>
-    <w:bookmarkEnd w:id="157"/>
-    <w:bookmarkStart w:id="158" w:name="stock-recruitment-relationship"/>
+    <w:bookmarkEnd w:id="165"/>
+    <w:bookmarkStart w:id="166" w:name="stock-recruitment-relationship"/>
     <w:p>
       <w:pPr>
         <w:pStyle w:val="Heading2"/>
@@ -24073,8 +24392,8 @@
         <w:t xml:space="preserve">, recruitment is assigned across two stocks with a more complex regime structure, including the 1999 shift described in the control file.</w:t>
       </w:r>
     </w:p>
-    <w:bookmarkEnd w:id="158"/>
-    <w:bookmarkStart w:id="159" w:name="fishing-mortality-and-catch"/>
+    <w:bookmarkEnd w:id="166"/>
+    <w:bookmarkStart w:id="167" w:name="fishing-mortality-and-catch"/>
     <w:p>
       <w:pPr>
         <w:pStyle w:val="Heading2"/>
@@ -24750,8 +25069,8 @@
         </m:oMath>
       </m:oMathPara>
     </w:p>
-    <w:bookmarkEnd w:id="159"/>
-    <w:bookmarkStart w:id="160" w:name="abundance-indices"/>
+    <w:bookmarkEnd w:id="167"/>
+    <w:bookmarkStart w:id="168" w:name="abundance-indices"/>
     <w:p>
       <w:pPr>
         <w:pStyle w:val="Heading2"/>
@@ -25158,8 +25477,8 @@
         <w:t xml:space="preserve">places the survey or CPUE observation within the year. This expression is schematic because some indices are closer to numbers-at-age and others to biomass, but it captures the model logic used across the SC13 index components.</w:t>
       </w:r>
     </w:p>
-    <w:bookmarkEnd w:id="160"/>
-    <w:bookmarkStart w:id="161" w:name="age-and-length-compositions"/>
+    <w:bookmarkEnd w:id="168"/>
+    <w:bookmarkStart w:id="169" w:name="age-and-length-compositions"/>
     <w:p>
       <w:pPr>
         <w:pStyle w:val="Heading2"/>
@@ -25672,8 +25991,8 @@
         <w:t xml:space="preserve">, derived from the von Bertalanffy growth specification used by the model.</w:t>
       </w:r>
     </w:p>
-    <w:bookmarkEnd w:id="161"/>
-    <w:bookmarkStart w:id="162" w:name="observation-likelihoods"/>
+    <w:bookmarkEnd w:id="169"/>
+    <w:bookmarkStart w:id="170" w:name="observation-likelihoods"/>
     <w:p>
       <w:pPr>
         <w:pStyle w:val="Heading2"/>
@@ -26282,8 +26601,8 @@
         <w:t xml:space="preserve">The SC13 model uses Francis weighting for age-composition effective sample sizes, so the composition likelihood is strongly affected by those externally specified weights.</w:t>
       </w:r>
     </w:p>
-    <w:bookmarkEnd w:id="162"/>
-    <w:bookmarkStart w:id="163" w:name="objective-function"/>
+    <w:bookmarkEnd w:id="170"/>
+    <w:bookmarkStart w:id="171" w:name="objective-function"/>
     <w:p>
       <w:pPr>
         <w:pStyle w:val="Heading2"/>
@@ -26629,8 +26948,8 @@
         <w:t xml:space="preserve">, is especially important in SC13 because the model includes extensive penalties on fishery and survey selectivity trajectories to regularize the time-varying non-parametric selectivity schedules.</w:t>
       </w:r>
     </w:p>
-    <w:bookmarkEnd w:id="163"/>
-    <w:bookmarkStart w:id="164" w:name="dynamic-reference-points"/>
+    <w:bookmarkEnd w:id="171"/>
+    <w:bookmarkStart w:id="172" w:name="dynamic-reference-points"/>
     <w:p>
       <w:pPr>
         <w:pStyle w:val="Heading2"/>
@@ -27084,9 +27403,9 @@
         <w:t xml:space="preserve">vary through time in the SC13 assessment rather than remaining fixed constants.</w:t>
       </w:r>
     </w:p>
-    <w:bookmarkEnd w:id="164"/>
-    <w:bookmarkEnd w:id="165"/>
-    <w:bookmarkStart w:id="194" w:name="references"/>
+    <w:bookmarkEnd w:id="172"/>
+    <w:bookmarkEnd w:id="173"/>
+    <w:bookmarkStart w:id="202" w:name="references"/>
     <w:p>
       <w:pPr>
         <w:pStyle w:val="Heading1"/>
@@ -27095,8 +27414,8 @@
         <w:t xml:space="preserve">References</w:t>
       </w:r>
     </w:p>
-    <w:bookmarkStart w:id="193" w:name="refs"/>
-    <w:bookmarkStart w:id="166" w:name="ref-beverton1957dynamics"/>
+    <w:bookmarkStart w:id="201" w:name="refs"/>
+    <w:bookmarkStart w:id="174" w:name="ref-beverton1957dynamics"/>
     <w:p>
       <w:pPr>
         <w:pStyle w:val="Bibliography"/>
@@ -27121,8 +27440,8 @@
         <w:t xml:space="preserve">(Vol. 19, p. 533). H. M. Stationery Office.</w:t>
       </w:r>
     </w:p>
-    <w:bookmarkEnd w:id="166"/>
-    <w:bookmarkStart w:id="168" w:name="ref-butterworth1999procedures"/>
+    <w:bookmarkEnd w:id="174"/>
+    <w:bookmarkStart w:id="176" w:name="ref-butterworth1999procedures"/>
     <w:p>
       <w:pPr>
         <w:pStyle w:val="Bibliography"/>
@@ -27159,7 +27478,7 @@
       <w:r>
         <w:t xml:space="preserve"> </w:t>
       </w:r>
-      <w:hyperlink r:id="rId167">
+      <w:hyperlink r:id="rId175">
         <w:r>
           <w:rPr>
             <w:rStyle w:val="Hyperlink"/>
@@ -27168,8 +27487,8 @@
         </w:r>
       </w:hyperlink>
     </w:p>
-    <w:bookmarkEnd w:id="168"/>
-    <w:bookmarkStart w:id="170" w:name="ref-carruthers2024roadmap"/>
+    <w:bookmarkEnd w:id="176"/>
+    <w:bookmarkStart w:id="178" w:name="ref-carruthers2024roadmap"/>
     <w:p>
       <w:pPr>
         <w:pStyle w:val="Bibliography"/>
@@ -27232,7 +27551,7 @@
       <w:r>
         <w:t xml:space="preserve"> </w:t>
       </w:r>
-      <w:hyperlink r:id="rId169">
+      <w:hyperlink r:id="rId177">
         <w:r>
           <w:rPr>
             <w:rStyle w:val="Hyperlink"/>
@@ -27241,8 +27560,8 @@
         </w:r>
       </w:hyperlink>
     </w:p>
-    <w:bookmarkEnd w:id="170"/>
-    <w:bookmarkStart w:id="172" w:name="ref-fournier2012admb"/>
+    <w:bookmarkEnd w:id="178"/>
+    <w:bookmarkStart w:id="180" w:name="ref-fournier2012admb"/>
     <w:p>
       <w:pPr>
         <w:pStyle w:val="Bibliography"/>
@@ -27279,7 +27598,7 @@
       <w:r>
         <w:t xml:space="preserve"> </w:t>
       </w:r>
-      <w:hyperlink r:id="rId171">
+      <w:hyperlink r:id="rId179">
         <w:r>
           <w:rPr>
             <w:rStyle w:val="Hyperlink"/>
@@ -27288,8 +27607,8 @@
         </w:r>
       </w:hyperlink>
     </w:p>
-    <w:bookmarkEnd w:id="172"/>
-    <w:bookmarkStart w:id="174" w:name="ref-fournier1982catchage"/>
+    <w:bookmarkEnd w:id="180"/>
+    <w:bookmarkStart w:id="182" w:name="ref-fournier1982catchage"/>
     <w:p>
       <w:pPr>
         <w:pStyle w:val="Bibliography"/>
@@ -27326,7 +27645,7 @@
       <w:r>
         <w:t xml:space="preserve"> </w:t>
       </w:r>
-      <w:hyperlink r:id="rId173">
+      <w:hyperlink r:id="rId181">
         <w:r>
           <w:rPr>
             <w:rStyle w:val="Hyperlink"/>
@@ -27335,8 +27654,8 @@
         </w:r>
       </w:hyperlink>
     </w:p>
-    <w:bookmarkEnd w:id="174"/>
-    <w:bookmarkStart w:id="176" w:name="ref-francis2011weighting"/>
+    <w:bookmarkEnd w:id="182"/>
+    <w:bookmarkStart w:id="184" w:name="ref-francis2011weighting"/>
     <w:p>
       <w:pPr>
         <w:pStyle w:val="Bibliography"/>
@@ -27373,7 +27692,7 @@
       <w:r>
         <w:t xml:space="preserve"> </w:t>
       </w:r>
-      <w:hyperlink r:id="rId175">
+      <w:hyperlink r:id="rId183">
         <w:r>
           <w:rPr>
             <w:rStyle w:val="Hyperlink"/>
@@ -27382,8 +27701,8 @@
         </w:r>
       </w:hyperlink>
     </w:p>
-    <w:bookmarkEnd w:id="176"/>
-    <w:bookmarkStart w:id="178" w:name="ref-hilborn1992quantitative"/>
+    <w:bookmarkEnd w:id="184"/>
+    <w:bookmarkStart w:id="186" w:name="ref-hilborn1992quantitative"/>
     <w:p>
       <w:pPr>
         <w:pStyle w:val="Bibliography"/>
@@ -27407,7 +27726,7 @@
       <w:r>
         <w:t xml:space="preserve"> </w:t>
       </w:r>
-      <w:hyperlink r:id="rId177">
+      <w:hyperlink r:id="rId185">
         <w:r>
           <w:rPr>
             <w:rStyle w:val="Hyperlink"/>
@@ -27416,8 +27735,8 @@
         </w:r>
       </w:hyperlink>
     </w:p>
-    <w:bookmarkEnd w:id="178"/>
-    <w:bookmarkStart w:id="180" w:name="ref-linton2011selectivity"/>
+    <w:bookmarkEnd w:id="186"/>
+    <w:bookmarkStart w:id="188" w:name="ref-linton2011selectivity"/>
     <w:p>
       <w:pPr>
         <w:pStyle w:val="Bibliography"/>
@@ -27454,7 +27773,7 @@
       <w:r>
         <w:t xml:space="preserve"> </w:t>
       </w:r>
-      <w:hyperlink r:id="rId179">
+      <w:hyperlink r:id="rId187">
         <w:r>
           <w:rPr>
             <w:rStyle w:val="Hyperlink"/>
@@ -27463,8 +27782,8 @@
         </w:r>
       </w:hyperlink>
     </w:p>
-    <w:bookmarkEnd w:id="180"/>
-    <w:bookmarkStart w:id="182" w:name="ref-punt2016bestpractices"/>
+    <w:bookmarkEnd w:id="188"/>
+    <w:bookmarkStart w:id="190" w:name="ref-punt2016bestpractices"/>
     <w:p>
       <w:pPr>
         <w:pStyle w:val="Bibliography"/>
@@ -27501,7 +27820,7 @@
       <w:r>
         <w:t xml:space="preserve"> </w:t>
       </w:r>
-      <w:hyperlink r:id="rId181">
+      <w:hyperlink r:id="rId189">
         <w:r>
           <w:rPr>
             <w:rStyle w:val="Hyperlink"/>
@@ -27510,8 +27829,8 @@
         </w:r>
       </w:hyperlink>
     </w:p>
-    <w:bookmarkEnd w:id="182"/>
-    <w:bookmarkStart w:id="184" w:name="ref-rousseau2019fleets"/>
+    <w:bookmarkEnd w:id="190"/>
+    <w:bookmarkStart w:id="192" w:name="ref-rousseau2019fleets"/>
     <w:p>
       <w:pPr>
         <w:pStyle w:val="Bibliography"/>
@@ -27548,7 +27867,7 @@
       <w:r>
         <w:t xml:space="preserve"> </w:t>
       </w:r>
-      <w:hyperlink r:id="rId183">
+      <w:hyperlink r:id="rId191">
         <w:r>
           <w:rPr>
             <w:rStyle w:val="Hyperlink"/>
@@ -27557,8 +27876,8 @@
         </w:r>
       </w:hyperlink>
     </w:p>
-    <w:bookmarkEnd w:id="184"/>
-    <w:bookmarkStart w:id="186" w:name="ref-schnute1995error"/>
+    <w:bookmarkEnd w:id="192"/>
+    <w:bookmarkStart w:id="194" w:name="ref-schnute1995error"/>
     <w:p>
       <w:pPr>
         <w:pStyle w:val="Bibliography"/>
@@ -27595,7 +27914,7 @@
       <w:r>
         <w:t xml:space="preserve"> </w:t>
       </w:r>
-      <w:hyperlink r:id="rId185">
+      <w:hyperlink r:id="rId193">
         <w:r>
           <w:rPr>
             <w:rStyle w:val="Hyperlink"/>
@@ -27604,8 +27923,8 @@
         </w:r>
       </w:hyperlink>
     </w:p>
-    <w:bookmarkEnd w:id="186"/>
-    <w:bookmarkStart w:id="188" w:name="ref-siple2021smallpelagics"/>
+    <w:bookmarkEnd w:id="194"/>
+    <w:bookmarkStart w:id="196" w:name="ref-siple2021smallpelagics"/>
     <w:p>
       <w:pPr>
         <w:pStyle w:val="Bibliography"/>
@@ -27642,7 +27961,7 @@
       <w:r>
         <w:t xml:space="preserve"> </w:t>
       </w:r>
-      <w:hyperlink r:id="rId187">
+      <w:hyperlink r:id="rId195">
         <w:r>
           <w:rPr>
             <w:rStyle w:val="Hyperlink"/>
@@ -27651,8 +27970,8 @@
         </w:r>
       </w:hyperlink>
     </w:p>
-    <w:bookmarkEnd w:id="188"/>
-    <w:bookmarkStart w:id="190" w:name="ref-sprfmo2025mseworkshop"/>
+    <w:bookmarkEnd w:id="196"/>
+    <w:bookmarkStart w:id="198" w:name="ref-sprfmo2025mseworkshop"/>
     <w:p>
       <w:pPr>
         <w:pStyle w:val="Bibliography"/>
@@ -27721,7 +28040,7 @@
       <w:r>
         <w:t xml:space="preserve"> </w:t>
       </w:r>
-      <w:hyperlink r:id="rId189">
+      <w:hyperlink r:id="rId197">
         <w:r>
           <w:rPr>
             <w:rStyle w:val="Hyperlink"/>
@@ -27730,8 +28049,8 @@
         </w:r>
       </w:hyperlink>
     </w:p>
-    <w:bookmarkEnd w:id="190"/>
-    <w:bookmarkStart w:id="192" w:name="ref-sprfmo2025annex11"/>
+    <w:bookmarkEnd w:id="198"/>
+    <w:bookmarkStart w:id="200" w:name="ref-sprfmo2025annex11"/>
     <w:p>
       <w:pPr>
         <w:pStyle w:val="Bibliography"/>
@@ -27755,7 +28074,7 @@
       <w:r>
         <w:t xml:space="preserve"> </w:t>
       </w:r>
-      <w:hyperlink r:id="rId191">
+      <w:hyperlink r:id="rId199">
         <w:r>
           <w:rPr>
             <w:rStyle w:val="Hyperlink"/>
@@ -27764,9 +28083,9 @@
         </w:r>
       </w:hyperlink>
     </w:p>
-    <w:bookmarkEnd w:id="192"/>
-    <w:bookmarkEnd w:id="193"/>
-    <w:bookmarkEnd w:id="194"/>
+    <w:bookmarkEnd w:id="200"/>
+    <w:bookmarkEnd w:id="201"/>
+    <w:bookmarkEnd w:id="202"/>
     <w:sectPr>
       <w:footnotePr>
         <w:numRestart w:val="eachSect"/>

</xml_diff>